<commit_message>
docs: synchronize deployment and user guides with sqlite standalone lan mode
Co-authored-by: arena-agent <297053741+arena-agent@users.noreply.github.com>
</commit_message>
<xml_diff>
--- a/docs/GUIDE_DEPLOIEMENT_WINDOWS.docx
+++ b/docs/GUIDE_DEPLOIEMENT_WINDOWS.docx
@@ -2115,6 +2115,209 @@
       </w:r>
       <w:r>
         <w:t xml:space="preserve"> : Avant de quitter le site ou de clore votre intervention, ré-exécutez toujours `verrouiller-dossier-anti-copie.bat` en tant qu'administrateur pour réactiver le bouclier NTFS.</w:t>
+      </w:r>
+    </w:p>
+    <w:p>
+      <w:pPr>
+        <w:spacing w:after="60"/>
+      </w:pPr>
+      <w:r>
+        <w:t>---</w:t>
+      </w:r>
+    </w:p>
+    <w:p>
+      <w:pPr>
+        <w:spacing w:before="240" w:after="80"/>
+      </w:pPr>
+      <w:r>
+        <w:rPr>
+          <w:b/>
+          <w:color w:val="006699"/>
+          <w:sz w:val="32"/>
+        </w:rPr>
+        <w:t>3.6 Déploiement alternatif : Mode 100% Autonome Embarqué (SQLite &amp; Réseau Local)</w:t>
+      </w:r>
+    </w:p>
+    <w:p>
+      <w:pPr>
+        <w:spacing w:after="60"/>
+      </w:pPr>
+      <w:r>
+        <w:t>Pour les établissements scolaires ne disposant pas de Docker Desktop ou souhaitant une installation ultra-légère sans conteneurisation ni service PostgreSQL/Redis :</w:t>
+      </w:r>
+    </w:p>
+    <w:p>
+      <w:pPr>
+        <w:spacing w:before="160" w:after="40"/>
+      </w:pPr>
+      <w:r>
+        <w:rPr>
+          <w:b/>
+          <w:color w:val="333333"/>
+          <w:sz w:val="26"/>
+        </w:rPr>
+        <w:t>Caractéristiques du Mode SQLite</w:t>
+      </w:r>
+    </w:p>
+    <w:p>
+      <w:pPr>
+        <w:pStyle w:val="ListBullet"/>
+      </w:pPr>
+      <w:r/>
+      <w:r>
+        <w:rPr>
+          <w:b/>
+        </w:rPr>
+        <w:t>Zéro installation de serveur de base de données</w:t>
+      </w:r>
+      <w:r>
+        <w:t xml:space="preserve"> : un simple interpréteur Python 3.10+ sur la machine serveur suffit.</w:t>
+      </w:r>
+    </w:p>
+    <w:p>
+      <w:pPr>
+        <w:pStyle w:val="ListBullet"/>
+      </w:pPr>
+      <w:r/>
+      <w:r>
+        <w:rPr>
+          <w:b/>
+        </w:rPr>
+        <w:t>Accès Multi-Postes en Réseau Local (LAN)</w:t>
+      </w:r>
+      <w:r>
+        <w:t xml:space="preserve"> : 15 à 25 ordinateurs (secrétariat, caisse, professeurs, direction) accèdent en simultané via leur navigateur (`http://IP-SERVEUR:8000`).</w:t>
+      </w:r>
+    </w:p>
+    <w:p>
+      <w:pPr>
+        <w:pStyle w:val="ListBullet"/>
+      </w:pPr>
+      <w:r/>
+      <w:r>
+        <w:rPr>
+          <w:b/>
+        </w:rPr>
+        <w:t>Base embarquée unique</w:t>
+      </w:r>
+      <w:r>
+        <w:t xml:space="preserve"> : Stockée dans `data\yelen_school.sqlite3`.</w:t>
+      </w:r>
+    </w:p>
+    <w:p>
+      <w:pPr>
+        <w:pStyle w:val="ListBullet"/>
+      </w:pPr>
+      <w:r/>
+      <w:r>
+        <w:rPr>
+          <w:b/>
+        </w:rPr>
+        <w:t>Haute performance concurrente</w:t>
+      </w:r>
+      <w:r>
+        <w:t xml:space="preserve"> : Activé en mode WAL (*Write-Ahead Logging*) via `core/db_sqlite.py` avec attente active de 30 secondes pour éliminer les erreurs de verrouillage.</w:t>
+      </w:r>
+    </w:p>
+    <w:p>
+      <w:pPr>
+        <w:spacing w:before="160" w:after="40"/>
+      </w:pPr>
+      <w:r>
+        <w:rPr>
+          <w:b/>
+          <w:color w:val="333333"/>
+          <w:sz w:val="26"/>
+        </w:rPr>
+        <w:t>Procédure de lancement 1-Clic</w:t>
+      </w:r>
+    </w:p>
+    <w:p>
+      <w:pPr>
+        <w:spacing w:after="60"/>
+      </w:pPr>
+      <w:r>
+        <w:t>1. Lancez simplement le script à la racine :</w:t>
+      </w:r>
+    </w:p>
+    <w:p>
+      <w:pPr>
+        <w:spacing w:after="60"/>
+      </w:pPr>
+      <w:r>
+        <w:t xml:space="preserve">   ```cmd</w:t>
+      </w:r>
+    </w:p>
+    <w:p>
+      <w:pPr>
+        <w:spacing w:after="60"/>
+      </w:pPr>
+      <w:r>
+        <w:t xml:space="preserve">   demarrer-sqlite.bat</w:t>
+      </w:r>
+    </w:p>
+    <w:p>
+      <w:pPr>
+        <w:spacing w:after="60"/>
+      </w:pPr>
+      <w:r>
+        <w:t xml:space="preserve">   ```</w:t>
+      </w:r>
+    </w:p>
+    <w:p>
+      <w:pPr>
+        <w:spacing w:after="60"/>
+      </w:pPr>
+      <w:r>
+        <w:t>2. Le script exécute automatiquement :</w:t>
+      </w:r>
+    </w:p>
+    <w:p>
+      <w:pPr>
+        <w:spacing w:after="60"/>
+      </w:pPr>
+      <w:r>
+        <w:t xml:space="preserve">   - L'auto-configuration du fichier `.env` (`DB_ENGINE=sqlite`, `SQLITE_PATH=data/yelen_school.sqlite3`, `CACHE_BACKEND=database`, `ALLOWED_HOSTS=*`).</w:t>
+      </w:r>
+    </w:p>
+    <w:p>
+      <w:pPr>
+        <w:spacing w:after="60"/>
+      </w:pPr>
+      <w:r>
+        <w:t xml:space="preserve">   - La vérification du bouclier anti-copie physique (`verifier-integrite-anti-copie.bat`).</w:t>
+      </w:r>
+    </w:p>
+    <w:p>
+      <w:pPr>
+        <w:spacing w:after="60"/>
+      </w:pPr>
+      <w:r>
+        <w:t xml:space="preserve">   - L'application des migrations et la collecte des fichiers statiques.</w:t>
+      </w:r>
+    </w:p>
+    <w:p>
+      <w:pPr>
+        <w:spacing w:after="60"/>
+      </w:pPr>
+      <w:r>
+        <w:t xml:space="preserve">   - L'ouverture automatique du port 8000 dans le pare-feu Windows.</w:t>
+      </w:r>
+    </w:p>
+    <w:p>
+      <w:pPr>
+        <w:spacing w:after="60"/>
+      </w:pPr>
+      <w:r>
+        <w:t xml:space="preserve">   - La détection de l'adresse IP locale du serveur affichée à l'écran pour les postes clients.</w:t>
+      </w:r>
+    </w:p>
+    <w:p>
+      <w:pPr>
+        <w:spacing w:after="60"/>
+      </w:pPr>
+      <w:r>
+        <w:t xml:space="preserve">   - Le démarrage du serveur multi-threads Waitress.</w:t>
       </w:r>
     </w:p>
     <w:p>

</xml_diff>